<commit_message>
Fill project document details
</commit_message>
<xml_diff>
--- a/docs/MCP-Guard实验室项目情况.docx
+++ b/docs/MCP-Guard实验室项目情况.docx
@@ -214,7 +214,7 @@
                 <w:b w:val="0"/>
                 <w:sz w:val="21"/>
               </w:rPr>
-              <w:t>待上传至 GitHub / Gitee 后填写</w:t>
+              <w:t>https://github.com/xjwjaywen/mcp-guard</w:t>
             </w:r>
           </w:p>
         </w:tc>
@@ -254,7 +254,7 @@
                 <w:b w:val="0"/>
                 <w:sz w:val="21"/>
               </w:rPr>
-              <w:t>2026年5月14日</w:t>
+              <w:t>2026年5月14日—至今</w:t>
             </w:r>
           </w:p>
         </w:tc>
@@ -414,7 +414,7 @@
                 <w:b w:val="0"/>
                 <w:sz w:val="21"/>
               </w:rPr>
-              <w:t>约 2384 行代码（不含自动生成报告文件）</w:t>
+              <w:t>约 2635 行代码（不含虚拟环境、缓存和自动生成报告文件）</w:t>
             </w:r>
           </w:p>
         </w:tc>

</xml_diff>